<commit_message>
PD RAL v4: revisión de jefatura (PR305 en 4.4, 9 y anexo A; anexo A completo; Packet Tracer solo como certificación; erratas y tono formal)
</commit_message>
<xml_diff>
--- a/Planificación/PD_RAL_2026_27.docx
+++ b/Planificación/PD_RAL_2026_27.docx
@@ -523,12 +523,12 @@
           <ns0:numId ns0:val="1006"/>
         </ns0:numPr>
       </ns0:pPr>
-      <ns0:hyperlink ns0:anchor="cómo-se-calcula-la-nota-figura-para-word">
+      <ns0:hyperlink ns0:anchor="cómo-se-calcula-la-nota">
         <ns0:r>
           <ns0:rPr>
             <ns0:rStyle ns0:val="Hyperlink"/>
           </ns0:rPr>
-          <ns0:t xml:space="preserve">Cómo se calcula la nota (figura para Word)</ns0:t>
+          <ns0:t xml:space="preserve">Cómo se calcula la nota</ns0:t>
         </ns0:r>
       </ns0:hyperlink>
     </ns0:p>
@@ -540,12 +540,12 @@
           <ns0:numId ns0:val="1006"/>
         </ns0:numPr>
       </ns0:pPr>
-      <ns0:hyperlink ns0:anchor="peso-de-cada-ra-figura-para-word">
+      <ns0:hyperlink ns0:anchor="peso-de-cada-ra">
         <ns0:r>
           <ns0:rPr>
             <ns0:rStyle ns0:val="Hyperlink"/>
           </ns0:rPr>
-          <ns0:t xml:space="preserve">Peso de cada RA (figura para Word)</ns0:t>
+          <ns0:t xml:space="preserve">Peso de cada RA</ns0:t>
         </ns0:r>
       </ns0:hyperlink>
     </ns0:p>
@@ -1764,12 +1764,12 @@
           <ns0:numId ns0:val="1021"/>
         </ns0:numPr>
       </ns0:pPr>
-      <ns0:hyperlink ns0:anchor="a.2.-matriz-ce-ie-para-word">
+      <ns0:hyperlink ns0:anchor="a.2.-matriz-ce-ie">
         <ns0:r>
           <ns0:rPr>
             <ns0:rStyle ns0:val="Hyperlink"/>
           </ns0:rPr>
-          <ns0:t xml:space="preserve">A.2. Matriz CE × IE (para Word)</ns0:t>
+          <ns0:t xml:space="preserve">A.2. Matriz CE × IE</ns0:t>
         </ns0:r>
       </ns0:hyperlink>
     </ns0:p>
@@ -2554,7 +2554,7 @@
         <ns0:pStyle ns0:val="BodyText"/>
       </ns0:pPr>
       <ns0:r>
-        <ns0:t xml:space="preserve">En el ámbito autonómico se tienen en cuenta la Orden 8/2025, de evaluación en Formación Profesional; el Decreto 114/2025, de currículos; la Resolución de 16 de julio de 2026, de instrucciones para los grados D y E en el curso 2026-2027 (documento 2026_24495_es, DOGV); la resolución del calendario escolar 2026-2027; el Decreto 104/2018 y la Orden 20/2019, de inclusión; el Decreto 252/2019, de centros; y el currículo autonómico de Sistemas Microinformáticos y Redes que esté vigente.</ns0:t>
+        <ns0:t xml:space="preserve">En el ámbito autonómico se tienen en cuenta la Orden 8/2025, de evaluación en Formación Profesional; el Decreto 114/2025, de currículos; la Resolución de 16 de julio de 2026, de instrucciones para los grados D y E en el curso 2026-2027 (DOGV núm. 10408); la resolución del calendario escolar 2026-2027; el Decreto 104/2018 y la Orden 20/2019, de inclusión; el Decreto 252/2019, de centros; y el currículo autonómico de Sistemas Microinformáticos y Redes que esté vigente.</ns0:t>
       </ns0:r>
     </ns0:p>
     <ns0:p>
@@ -2676,7 +2676,7 @@
               <ns0:t xml:space="preserve"> </ns0:t>
             </ns0:r>
             <ns0:r>
-              <ns0:t xml:space="preserve">(T1–T9; tradicionalmente UT), con núcleo enlace/IP/VLAN antes del margen FE</ns0:t>
+              <ns0:t xml:space="preserve">(T1–T9; tradicionalmente UT), con el bloque de enlace, direccionamiento IP y VLAN antes de la formación en empresa</ns0:t>
             </ns0:r>
           </ns0:p>
         </ns0:tc>
@@ -3320,7 +3320,7 @@
           <ns0:b/>
           <ns0:bCs/>
         </ns0:rPr>
-        <ns0:t xml:space="preserve">0225 Redes locales</ns0:t>
+        <ns0:t xml:space="preserve">0225 Redes de área local</ns0:t>
       </ns0:r>
       <ns0:r>
         <ns0:t xml:space="preserve"> </ns0:t>
@@ -5660,13 +5660,13 @@
         <ns0:t xml:space="preserve">(no dividir la nota en % conceptual/procedimental/actitudinal al evaluar CE).</ns0:t>
       </ns0:r>
     </ns0:p>
-    <ns0:bookmarkStart ns0:id="33" ns0:name="cómo-se-calcula-la-nota-figura-para-word"/>
+    <ns0:bookmarkStart ns0:id="33" ns0:name="cómo-se-calcula-la-nota"/>
     <ns0:p>
       <ns0:pPr>
         <ns0:pStyle ns0:val="Heading3"/>
       </ns0:pPr>
       <ns0:r>
-        <ns0:t xml:space="preserve">Cómo se calcula la nota (figura para Word)</ns0:t>
+        <ns0:t xml:space="preserve">Cómo se calcula la nota</ns0:t>
       </ns0:r>
     </ns0:p>
     <ns0:p>
@@ -5678,7 +5678,7 @@
           <ns4:inline>
             <ns4:extent cx="5930900" cy="5105353"/>
             <ns4:effectExtent b="0" l="0" r="0" t="0"/>
-            <ns4:docPr descr="Cálculo de la nota: Instrumentos → RA → nota final (+1 NetAcad)" title="" id="31" name="Picture"/>
+            <ns4:docPr descr="Cálculo de la nota: instrumentos → RA → nota final (+1 de certificación)" title="" id="31" name="Picture"/>
             <ns5:graphic>
               <ns5:graphicData uri="http://schemas.openxmlformats.org/drawingml/2006/picture">
                 <ns6:pic>
@@ -5721,7 +5721,7 @@
         <ns0:pStyle ns0:val="ImageCaption"/>
       </ns0:pPr>
       <ns0:r>
-        <ns0:t xml:space="preserve">Cálculo de la nota: Instrumentos → RA → nota final (+1 NetAcad)</ns0:t>
+        <ns0:t xml:space="preserve">Cálculo de la nota: instrumentos → RA → nota final (+1 de certificación)</ns0:t>
       </ns0:r>
     </ns0:p>
     <ns0:tbl>
@@ -5955,13 +5955,13 @@
       </ns0:tr>
     </ns0:tbl>
     <ns0:bookmarkEnd ns0:id="33"/>
-    <ns0:bookmarkStart ns0:id="37" ns0:name="peso-de-cada-ra-figura-para-word"/>
+    <ns0:bookmarkStart ns0:id="37" ns0:name="peso-de-cada-ra"/>
     <ns0:p>
       <ns0:pPr>
         <ns0:pStyle ns0:val="Heading3"/>
       </ns0:pPr>
       <ns0:r>
-        <ns0:t xml:space="preserve">Peso de cada RA (figura para Word)</ns0:t>
+        <ns0:t xml:space="preserve">Peso de cada RA</ns0:t>
       </ns0:r>
     </ns0:p>
     <ns0:p>
@@ -8846,10 +8846,13 @@
                 <ns0:b/>
                 <ns0:bCs/>
               </ns0:rPr>
-              <ns0:t xml:space="preserve">PR303 NetAcad WLAN</ns0:t>
-            </ns0:r>
-            <ns0:r>
-              <ns0:t xml:space="preserve">, PR302</ns0:t>
+              <ns0:t xml:space="preserve">PR305</ns0:t>
+            </ns0:r>
+            <ns0:r>
+              <ns0:t xml:space="preserve"> </ns0:t>
+            </ns0:r>
+            <ns0:r>
+              <ns0:t xml:space="preserve">(red inalámbrica real), PR302, PR303 (certificación)</ns0:t>
             </ns0:r>
           </ns0:p>
         </ns0:tc>
@@ -9109,7 +9112,7 @@
               <ns0:pStyle ns0:val="Compact"/>
             </ns0:pPr>
             <ns0:r>
-              <ns0:t xml:space="preserve">Enrutamiento / VLAN · PR601, PR602,</ns0:t>
+              <ns0:t xml:space="preserve">Enrutamiento / VLAN ·</ns0:t>
             </ns0:r>
             <ns0:r>
               <ns0:t xml:space="preserve"> </ns0:t>
@@ -9125,17 +9128,7 @@
               <ns0:t xml:space="preserve"> </ns0:t>
             </ns0:r>
             <ns0:r>
-              <ns0:t xml:space="preserve">(VLAN taller),</ns0:t>
-            </ns0:r>
-            <ns0:r>
-              <ns0:t xml:space="preserve"> </ns0:t>
-            </ns0:r>
-            <ns0:r>
-              <ns0:rPr>
-                <ns0:b/>
-                <ns0:bCs/>
-              </ns0:rPr>
-              <ns0:t xml:space="preserve">PR603 NetAcad</ns0:t>
+              <ns0:t xml:space="preserve">(VLAN taller), PR601, PR602 y PR603 (certificación)</ns0:t>
             </ns0:r>
           </ns0:p>
         </ns0:tc>
@@ -9936,7 +9929,7 @@
         <ns0:pStyle ns0:val="FirstParagraph"/>
       </ns0:pPr>
       <ns0:r>
-        <ns0:t xml:space="preserve">Prácticas de laboratorio/simulación (PT/NetAcad); proyectos (PY901); trabajo colaborativo; apoyo MkDocs (clase invertida parcial); resolución de problemas de diagnóstico (RA5).</ns0:t>
+        <ns0:t xml:space="preserve">Prácticas de taller y de laboratorio; simulación con Packet Tracer y NetAcad como trabajo del apartado de certificación; proyectos (PY901); trabajo colaborativo; apoyo MkDocs (clase invertida parcial); resolución de problemas de diagnóstico (RA5).</ns0:t>
       </ns0:r>
     </ns0:p>
     <ns0:bookmarkEnd ns0:id="49"/>
@@ -9970,14 +9963,15 @@
     <ns0:tbl>
       <ns0:tblPr>
         <ns0:tblStyle ns0:val="Table"/>
-        <ns0:tblW ns0:type="auto" ns0:w="0"/>
+        <ns0:tblW ns0:type="pct" ns0:w="5000"/>
+        <ns0:tblLayout ns0:type="fixed"/>
         <ns0:tblLook ns0:firstRow="1" ns0:lastRow="0" ns0:firstColumn="0" ns0:lastColumn="0" ns0:noHBand="0" ns0:noVBand="0" ns0:val="0020"/>
       </ns0:tblPr>
       <ns0:tblGrid>
-        <ns0:gridCol ns0:w="1980"/>
-        <ns0:gridCol ns0:w="1980"/>
-        <ns0:gridCol ns0:w="1980"/>
-        <ns0:gridCol ns0:w="1980"/>
+        <ns0:gridCol ns0:w="1697"/>
+        <ns0:gridCol ns0:w="2828"/>
+        <ns0:gridCol ns0:w="1697"/>
+        <ns0:gridCol ns0:w="1697"/>
       </ns0:tblGrid>
       <ns0:tr>
         <ns0:trPr>
@@ -10144,7 +10138,7 @@
               <ns0:keepLines/>
             </ns0:pPr>
             <ns0:r>
-              <ns0:t xml:space="preserve">Laboratorio, simulación, NetAcad</ns0:t>
+              <ns0:t xml:space="preserve">Práctica de taller o de laboratorio. Las de Packet Tracer son de certificación y no puntúan en el RA</ns0:t>
             </ns0:r>
           </ns0:p>
         </ns0:tc>
@@ -10429,7 +10423,7 @@
         <ns0:pStyle ns0:val="FirstParagraph"/>
       </ns0:pPr>
       <ns0:r>
-        <ns0:t xml:space="preserve">Coordinación con el equipo de 1SMR (SO, aplicaciones, seguridad). Si el centro desarrolla proyecto intermodular, se alinearán evidencias de red sin duplicar carga. La FE (sección 12) se insertará al fijarse la fecha.</ns0:t>
+        <ns0:t xml:space="preserve">Coordinación con el equipo docente de 1.º de SMR (sistemas operativos, aplicaciones y seguridad). Si el centro desarrolla proyecto intermodular, se alinearán evidencias de red sin duplicar carga. La formación en empresa se desarrolla en el apartado 12 y empieza el 17 de mayo de 2027.</ns0:t>
       </ns0:r>
     </ns0:p>
     <ns0:bookmarkEnd ns0:id="53"/>
@@ -13255,7 +13249,7 @@
               <ns0:t xml:space="preserve">PR304</ns0:t>
             </ns0:r>
             <ns0:r>
-              <ns0:t xml:space="preserve">, PR302,</ns0:t>
+              <ns0:t xml:space="preserve">,</ns0:t>
             </ns0:r>
             <ns0:r>
               <ns0:t xml:space="preserve"> </ns0:t>
@@ -13265,13 +13259,10 @@
                 <ns0:b/>
                 <ns0:bCs/>
               </ns0:rPr>
-              <ns0:t xml:space="preserve">PR303</ns0:t>
-            </ns0:r>
-            <ns0:r>
-              <ns0:t xml:space="preserve"> </ns0:t>
-            </ns0:r>
-            <ns0:r>
-              <ns0:t xml:space="preserve">· +</ns0:t>
+              <ns0:t xml:space="preserve">PR305</ns0:t>
+            </ns0:r>
+            <ns0:r>
+              <ns0:t xml:space="preserve">, PR302, PR303 (certificación) · +</ns0:t>
             </ns0:r>
             <ns0:r>
               <ns0:t xml:space="preserve"> </ns0:t>
@@ -13465,23 +13456,7 @@
               <ns0:t xml:space="preserve">PR604</ns0:t>
             </ns0:r>
             <ns0:r>
-              <ns0:t xml:space="preserve">,</ns0:t>
-            </ns0:r>
-            <ns0:r>
-              <ns0:t xml:space="preserve"> </ns0:t>
-            </ns0:r>
-            <ns0:r>
-              <ns0:rPr>
-                <ns0:b/>
-                <ns0:bCs/>
-              </ns0:rPr>
-              <ns0:t xml:space="preserve">PR603</ns0:t>
-            </ns0:r>
-            <ns0:r>
-              <ns0:t xml:space="preserve"> </ns0:t>
-            </ns0:r>
-            <ns0:r>
-              <ns0:t xml:space="preserve">· +</ns0:t>
+              <ns0:t xml:space="preserve">, PR603 (certificación) · +</ns0:t>
             </ns0:r>
             <ns0:r>
               <ns0:t xml:space="preserve"> </ns0:t>
@@ -14872,13 +14847,13 @@
         </ns0:tc>
       </ns0:tr>
     </ns0:tbl>
-    <ns0:bookmarkStart ns0:id="92" ns0:name="X215161717732c072a24f5b6e22762d1a88005a5"/>
+    <ns0:bookmarkStart ns0:id="92" ns0:name="Xa20dd10e726e08b6d6707f7a93f011da01dac3b"/>
     <ns0:p>
       <ns0:pPr>
         <ns0:pStyle ns0:val="Heading4"/>
       </ns0:pPr>
       <ns0:r>
-        <ns0:t xml:space="preserve">Secuencia orientativa de la UP 1 (18 sesiones).</ns0:t>
+        <ns0:t xml:space="preserve">Secuencia orientativa de la UP 1 (18 sesiones)</ns0:t>
       </ns0:r>
     </ns0:p>
     <ns0:tbl>
@@ -15736,13 +15711,13 @@
         </ns0:tc>
       </ns0:tr>
     </ns0:tbl>
-    <ns0:bookmarkStart ns0:id="94" ns0:name="Xde127ac5cb20e55e4c762019a2b6250262d38c0"/>
+    <ns0:bookmarkStart ns0:id="94" ns0:name="Xc595d85ab019d3c9b91d131d60dda6d0e7661b3"/>
     <ns0:p>
       <ns0:pPr>
         <ns0:pStyle ns0:val="Heading4"/>
       </ns0:pPr>
       <ns0:r>
-        <ns0:t xml:space="preserve">Secuencia orientativa de la UP 2 (13 sesiones).</ns0:t>
+        <ns0:t xml:space="preserve">Secuencia orientativa de la UP 2 (13 sesiones)</ns0:t>
       </ns0:r>
     </ns0:p>
     <ns0:tbl>
@@ -16513,7 +16488,7 @@
               <ns0:pStyle ns0:val="Compact"/>
             </ns0:pPr>
             <ns0:r>
-              <ns0:t xml:space="preserve">El reparto por fase suma las veintiuna sesiones. Actividades de los apuntes: cuestionario inicial, AC301, AC302, AC303, AC304, AC305, PR301, PR304, PR305, PR302, PR303 (casa), «Para el examen» y autocheck. PR305 figura en los apuntes y no en la columna de instrumentos clave del apartado 4.4; se incluye porque es la práctica real de red inalámbrica del tema.</ns0:t>
+              <ns0:t xml:space="preserve">El reparto por fase suma las veintiuna sesiones. Actividades de los apuntes: cuestionario inicial, AC301, AC302, AC303, AC304, AC305, PR301, PR304, PR305, PR302, PR303 (casa), «Para el examen» y autocheck.</ns0:t>
             </ns0:r>
           </ns0:p>
         </ns0:tc>
@@ -16600,13 +16575,13 @@
         </ns0:tc>
       </ns0:tr>
     </ns0:tbl>
-    <ns0:bookmarkStart ns0:id="96" ns0:name="Xeddd22854bdb15ed5c6fd5da839b1fabb32182e"/>
+    <ns0:bookmarkStart ns0:id="96" ns0:name="Xfb3b9b5a420a2c4736348caa2b94a37234f1c92"/>
     <ns0:p>
       <ns0:pPr>
         <ns0:pStyle ns0:val="Heading4"/>
       </ns0:pPr>
       <ns0:r>
-        <ns0:t xml:space="preserve">Secuencia orientativa de la UP 3 (21 sesiones).</ns0:t>
+        <ns0:t xml:space="preserve">Secuencia orientativa de la UP 3 (21 sesiones)</ns0:t>
       </ns0:r>
     </ns0:p>
     <ns0:tbl>
@@ -17574,13 +17549,13 @@
         </ns0:tc>
       </ns0:tr>
     </ns0:tbl>
-    <ns0:bookmarkStart ns0:id="98" ns0:name="X5268c7c1fb9acd79fad8c13f0c644043e63d031"/>
+    <ns0:bookmarkStart ns0:id="98" ns0:name="X3a4df294d3d6f59ba933c2bdc9589042340d3f4"/>
     <ns0:p>
       <ns0:pPr>
         <ns0:pStyle ns0:val="Heading4"/>
       </ns0:pPr>
       <ns0:r>
-        <ns0:t xml:space="preserve">Secuencia orientativa de la UP 4 (14 sesiones).</ns0:t>
+        <ns0:t xml:space="preserve">Secuencia orientativa de la UP 4 (14 sesiones)</ns0:t>
       </ns0:r>
     </ns0:p>
     <ns0:tbl>
@@ -18438,13 +18413,13 @@
         </ns0:tc>
       </ns0:tr>
     </ns0:tbl>
-    <ns0:bookmarkStart ns0:id="100" ns0:name="X97ae1db1f70317825230114ea04e9cc787c5df9"/>
+    <ns0:bookmarkStart ns0:id="100" ns0:name="Xe7721c3a0029e0ca2d49034cf45c2197d9b1c7a"/>
     <ns0:p>
       <ns0:pPr>
         <ns0:pStyle ns0:val="Heading4"/>
       </ns0:pPr>
       <ns0:r>
-        <ns0:t xml:space="preserve">Secuencia orientativa de la UP 5 (14 sesiones).</ns0:t>
+        <ns0:t xml:space="preserve">Secuencia orientativa de la UP 5 (14 sesiones)</ns0:t>
       </ns0:r>
     </ns0:p>
     <ns0:tbl>
@@ -19302,13 +19277,13 @@
         </ns0:tc>
       </ns0:tr>
     </ns0:tbl>
-    <ns0:bookmarkStart ns0:id="102" ns0:name="X44d9230965189102f13420d95bdb09b5d10c4c4"/>
+    <ns0:bookmarkStart ns0:id="102" ns0:name="X0cd39da10b72ce2c018511fdb51bcd64121749e"/>
     <ns0:p>
       <ns0:pPr>
         <ns0:pStyle ns0:val="Heading4"/>
       </ns0:pPr>
       <ns0:r>
-        <ns0:t xml:space="preserve">Secuencia orientativa de la UP 6 (21 sesiones).</ns0:t>
+        <ns0:t xml:space="preserve">Secuencia orientativa de la UP 6 (21 sesiones)</ns0:t>
       </ns0:r>
     </ns0:p>
     <ns0:tbl>
@@ -19919,7 +19894,7 @@
               <ns0:pStyle ns0:val="Compact"/>
             </ns0:pPr>
             <ns0:r>
-              <ns0:t xml:space="preserve">Anexo A para este tema: CE4g, CE4h, CE5a, CE5b, CE5d, CE5e y CE5h. También constan CE1a y CE1c, porque varias actividades del tema los etiquetan. El mapa del apartado 4.3 no asigna el RA1 a T7, así que el peso del RA1 no se traslada aquí. Los apuntes citan además CE5a y el anexo sí incluye T7 en CE5a.</ns0:t>
+              <ns0:t xml:space="preserve">Anexo A para este tema: CE4g, CE4h, CE5a, CE5b, CE5d, CE5e y CE5h. También constan CE1a y CE1c, porque varias actividades del tema los etiquetan. El mapa del apartado 4.3 no asigna el RA1 a T7, así que el peso del RA1 no se traslada aquí.</ns0:t>
             </ns0:r>
           </ns0:p>
         </ns0:tc>
@@ -20081,7 +20056,7 @@
               <ns0:pStyle ns0:val="Compact"/>
             </ns0:pPr>
             <ns0:r>
-              <ns0:t xml:space="preserve">El supuesto es el aula-taller del IES Macià Abela. Hay que saber qué puertos escuchan los equipos de práctica, escanear solo un equipo autorizado y proponer qué tráfico saliente e entrante tendría sentido permitir en un instituto. No se escanea ninguna red ajena al permiso del profesorado.</ns0:t>
+              <ns0:t xml:space="preserve">El supuesto es el aula-taller del IES Macià Abela. Hay que saber qué puertos escuchan los equipos de práctica, escanear solo un equipo autorizado y proponer qué tráfico saliente y entrante tendría sentido permitir en un instituto. No se escanea ninguna red ajena al permiso del profesorado.</ns0:t>
             </ns0:r>
           </ns0:p>
         </ns0:tc>
@@ -20276,13 +20251,13 @@
         </ns0:tc>
       </ns0:tr>
     </ns0:tbl>
-    <ns0:bookmarkStart ns0:id="104" ns0:name="X8ebb36a39023778131c7a994ddf7214e32e72cb"/>
+    <ns0:bookmarkStart ns0:id="104" ns0:name="X89e2e25738db1a97ecaae7d837e2dbe4201a3d9"/>
     <ns0:p>
       <ns0:pPr>
         <ns0:pStyle ns0:val="Heading4"/>
       </ns0:pPr>
       <ns0:r>
-        <ns0:t xml:space="preserve">Secuencia orientativa de la UP 7 (18 sesiones).</ns0:t>
+        <ns0:t xml:space="preserve">Secuencia orientativa de la UP 7 (18 sesiones)</ns0:t>
       </ns0:r>
     </ns0:p>
     <ns0:tbl>
@@ -21140,13 +21115,13 @@
         </ns0:tc>
       </ns0:tr>
     </ns0:tbl>
-    <ns0:bookmarkStart ns0:id="106" ns0:name="X4ed642a9cc790a5d62d15a25c7d9e9341b86159"/>
+    <ns0:bookmarkStart ns0:id="106" ns0:name="X647404cdb0f439751c8e355a4f505dbdb452218"/>
     <ns0:p>
       <ns0:pPr>
         <ns0:pStyle ns0:val="Heading4"/>
       </ns0:pPr>
       <ns0:r>
-        <ns0:t xml:space="preserve">Secuencia orientativa de la UP 8 (16 sesiones).</ns0:t>
+        <ns0:t xml:space="preserve">Secuencia orientativa de la UP 8 (16 sesiones)</ns0:t>
       </ns0:r>
     </ns0:p>
     <ns0:tbl>
@@ -21593,7 +21568,7 @@
               <ns0:pStyle ns0:val="Compact"/>
             </ns0:pPr>
             <ns0:r>
-              <ns0:t xml:space="preserve">Tercera evaluación, hasta el cierre orientativo de hacia el 5 de mayo de 2027. PO901 forma parte de los instrumentos de esta unidad y no tiene una fila propia en el apartado 4.4, a diferencia de PO1 y PO2.</ns0:t>
+              <ns0:t xml:space="preserve">Tercera evaluación, hasta el cierre orientativo, hacia el 5 de mayo de 2027. PO901 forma parte de los instrumentos de esta unidad y no tiene una fila propia en el apartado 4.4, a diferencia de PO1 y PO2.</ns0:t>
             </ns0:r>
           </ns0:p>
         </ns0:tc>
@@ -22004,13 +21979,13 @@
         </ns0:tc>
       </ns0:tr>
     </ns0:tbl>
-    <ns0:bookmarkStart ns0:id="108" ns0:name="reparto-de-la-up-9-55-sesiones."/>
+    <ns0:bookmarkStart ns0:id="108" ns0:name="reparto-de-la-up-9-55-sesiones"/>
     <ns0:p>
       <ns0:pPr>
         <ns0:pStyle ns0:val="Heading4"/>
       </ns0:pPr>
       <ns0:r>
-        <ns0:t xml:space="preserve">Reparto de la UP 9 (55 sesiones).</ns0:t>
+        <ns0:t xml:space="preserve">Reparto de la UP 9 (55 sesiones)</ns0:t>
       </ns0:r>
     </ns0:p>
     <ns0:p>
@@ -22332,7 +22307,7 @@
         <ns0:pStyle ns0:val="FirstParagraph"/>
       </ns0:pPr>
       <ns0:r>
-        <ns0:t xml:space="preserve">Múltiples formas de representación (MkDocs, diagramas, taller, simulador), de acción/expresión (práctica, diagrama,</ns0:t>
+        <ns0:t xml:space="preserve">Múltiples formas de representación (MkDocs, diagramas, taller, simulador), de acción y expresión (práctica, diagrama,</ns0:t>
       </ns0:r>
       <ns0:r>
         <ns0:t xml:space="preserve"> </ns0:t>
@@ -22344,7 +22319,7 @@
         <ns0:t xml:space="preserve">.md</ns0:t>
       </ns0:r>
       <ns0:r>
-        <ns0:t xml:space="preserve">, PO) y de implicación (casos, NetAcad, cooperativo, retos graduados). Instrucciones claras, checklists/rúbricas y pasos pequeños.</ns0:t>
+        <ns0:t xml:space="preserve">, PO) y de implicación (casos, NetAcad, cooperativo, retos graduados). Instrucciones claras, listas de comprobación, rúbricas y tareas en pasos cortos.</ns0:t>
       </ns0:r>
     </ns0:p>
     <ns0:bookmarkEnd ns0:id="112"/>
@@ -22393,7 +22368,7 @@
         <ns0:pStyle ns0:val="FirstParagraph"/>
       </ns0:pPr>
       <ns0:r>
-        <ns0:t xml:space="preserve">Según dictámenes / planes individualizados del equipo educativo y orientación, manteniendo los RA como referentes.</ns0:t>
+        <ns0:t xml:space="preserve">Según los dictámenes y planes individualizados del equipo educativo y del departamento de orientación, manteniendo los RA como referentes.</ns0:t>
       </ns0:r>
     </ns0:p>
     <ns0:bookmarkEnd ns0:id="114"/>
@@ -22444,7 +22419,7 @@
         <ns0:pStyle ns0:val="FirstParagraph"/>
       </ns0:pPr>
       <ns0:r>
-        <ns0:t xml:space="preserve">Coordinación con tutor/a y orientación; registro según protocolos del centro; revisión tras evaluación inicial y en sesiones de evaluación.</ns0:t>
+        <ns0:t xml:space="preserve">Coordinación con la tutoría del grupo y con el departamento de orientación; registro según protocolos del centro; revisión tras evaluación inicial y en sesiones de evaluación.</ns0:t>
       </ns0:r>
     </ns0:p>
     <ns0:p>
@@ -22598,7 +22573,7 @@
               <ns0:keepLines/>
             </ns0:pPr>
             <ns0:r>
-              <ns0:t xml:space="preserve">Integrado en PR303 / PR603</ns0:t>
+              <ns0:t xml:space="preserve">Vinculado al apartado de certificación (prácticas de Packet Tracer, como PR303 y PR603)</ns0:t>
             </ns0:r>
           </ns0:p>
         </ns0:tc>
@@ -23738,7 +23713,7 @@
               <ns0:keepLines/>
             </ns0:pPr>
             <ns0:r>
-              <ns0:t xml:space="preserve">PR701, PR801, PR902, PY901</ns0:t>
+              <ns0:t xml:space="preserve">PR701, PR902, PY901, PO901</ns0:t>
             </ns0:r>
           </ns0:p>
         </ns0:tc>
@@ -23833,13 +23808,13 @@
       </ns0:r>
     </ns0:p>
     <ns0:bookmarkEnd ns0:id="127"/>
-    <ns0:bookmarkStart ns0:id="128" ns0:name="a.2.-matriz-ce-ie-para-word"/>
+    <ns0:bookmarkStart ns0:id="128" ns0:name="a.2.-matriz-ce-ie"/>
     <ns0:p>
       <ns0:pPr>
         <ns0:pStyle ns0:val="Heading3"/>
       </ns0:pPr>
       <ns0:r>
-        <ns0:t xml:space="preserve">A.2. Matriz CE × IE (para Word)</ns0:t>
+        <ns0:t xml:space="preserve">A.2. Matriz CE × IE</ns0:t>
       </ns0:r>
     </ns0:p>
     <ns0:tbl>
@@ -23998,7 +23973,7 @@
               <ns0:pStyle ns0:val="Compact"/>
             </ns0:pPr>
             <ns0:r>
-              <ns0:t xml:space="preserve">AC102, AC103, AC104, AC401, AC402, AC403, AC404, AC501, AC502, AC503, AC504, AC505, AC5…</ns0:t>
+              <ns0:t xml:space="preserve">AC102, AC103, AC104, AC401, AC402, AC403, AC404, AC501, AC502, AC503, AC504, AC505, AC506, AC701, AC801, AC807, PR102, PR401, PR402, PR501, PR801</ns0:t>
             </ns0:r>
           </ns0:p>
         </ns0:tc>
@@ -24148,7 +24123,7 @@
               <ns0:pStyle ns0:val="Compact"/>
             </ns0:pPr>
             <ns0:r>
-              <ns0:t xml:space="preserve">AC102, AC103, AC401, AC403, AC501, AC701, AC707, AC801, PR101, PR102, PR401, PR402, PR5…</ns0:t>
+              <ns0:t xml:space="preserve">AC102, AC103, AC401, AC403, AC501, AC701, AC707, AC801, PR101, PR102, PR401, PR402, PR501, PR801</ns0:t>
             </ns0:r>
           </ns0:p>
         </ns0:tc>
@@ -25348,7 +25323,7 @@
               <ns0:pStyle ns0:val="Compact"/>
             </ns0:pPr>
             <ns0:r>
-              <ns0:t xml:space="preserve">AC305, AC601, AC602, AC603, AC604, AC605, AC606, AC607, AC608, PR301, PR302, PR601, PR6…</ns0:t>
+              <ns0:t xml:space="preserve">AC305, AC601, AC602, AC603, AC604, AC605, AC606, AC607, AC608, PR301, PR302, PR601, PR602</ns0:t>
             </ns0:r>
           </ns0:p>
         </ns0:tc>
@@ -25423,7 +25398,7 @@
               <ns0:pStyle ns0:val="Compact"/>
             </ns0:pPr>
             <ns0:r>
-              <ns0:t xml:space="preserve">AC301</ns0:t>
+              <ns0:t xml:space="preserve">AC301, PR305</ns0:t>
             </ns0:r>
           </ns0:p>
         </ns0:tc>
@@ -25873,7 +25848,7 @@
               <ns0:pStyle ns0:val="Compact"/>
             </ns0:pPr>
             <ns0:r>
-              <ns0:t xml:space="preserve">AC301, AC303, PR303</ns0:t>
+              <ns0:t xml:space="preserve">AC301, AC303, PR303, PR305</ns0:t>
             </ns0:r>
           </ns0:p>
         </ns0:tc>
@@ -25948,7 +25923,7 @@
               <ns0:pStyle ns0:val="Compact"/>
             </ns0:pPr>
             <ns0:r>
-              <ns0:t xml:space="preserve">AC303, PR303</ns0:t>
+              <ns0:t xml:space="preserve">AC303, PR303, PR305</ns0:t>
             </ns0:r>
           </ns0:p>
         </ns0:tc>
@@ -26023,7 +25998,7 @@
               <ns0:pStyle ns0:val="Compact"/>
             </ns0:pPr>
             <ns0:r>
-              <ns0:t xml:space="preserve">AC305, PR303</ns0:t>
+              <ns0:t xml:space="preserve">AC305, PR303, PR305</ns0:t>
             </ns0:r>
           </ns0:p>
         </ns0:tc>
@@ -26098,7 +26073,7 @@
               <ns0:pStyle ns0:val="Compact"/>
             </ns0:pPr>
             <ns0:r>
-              <ns0:t xml:space="preserve">PR303</ns0:t>
+              <ns0:t xml:space="preserve">PR303, PR305</ns0:t>
             </ns0:r>
           </ns0:p>
         </ns0:tc>
@@ -26173,7 +26148,7 @@
               <ns0:pStyle ns0:val="Compact"/>
             </ns0:pPr>
             <ns0:r>
-              <ns0:t xml:space="preserve">PR303</ns0:t>
+              <ns0:t xml:space="preserve">PR303, PR305</ns0:t>
             </ns0:r>
           </ns0:p>
         </ns0:tc>
@@ -26248,7 +26223,7 @@
               <ns0:pStyle ns0:val="Compact"/>
             </ns0:pPr>
             <ns0:r>
-              <ns0:t xml:space="preserve">PR303</ns0:t>
+              <ns0:t xml:space="preserve">PR303, PR305</ns0:t>
             </ns0:r>
           </ns0:p>
         </ns0:tc>
@@ -26323,7 +26298,7 @@
               <ns0:pStyle ns0:val="Compact"/>
             </ns0:pPr>
             <ns0:r>
-              <ns0:t xml:space="preserve">AC404, AC506, AC607, AC609, AC701, AC702, AC703, AC707, AC802, AC803, AC804, AC805, AC8…</ns0:t>
+              <ns0:t xml:space="preserve">AC404, AC506, AC607, AC609, AC701, AC702, AC703, AC707, AC802, AC803, AC804, AC805, AC807, AC808, PR402, PR501, PR601, PR602, PR701, PR702, PR801</ns0:t>
             </ns0:r>
           </ns0:p>
         </ns0:tc>
@@ -26473,7 +26448,7 @@
               <ns0:pStyle ns0:val="Compact"/>
             </ns0:pPr>
             <ns0:r>
-              <ns0:t xml:space="preserve">PR303</ns0:t>
+              <ns0:t xml:space="preserve">PR303, PR305</ns0:t>
             </ns0:r>
           </ns0:p>
         </ns0:tc>
@@ -26848,7 +26823,7 @@
               <ns0:pStyle ns0:val="Compact"/>
             </ns0:pPr>
             <ns0:r>
-              <ns0:t xml:space="preserve">AC704, AC705, AC804, AC901, AC902, AC903, AC905, AC906, PR701, PR702, PR801, PR901, PR9…</ns0:t>
+              <ns0:t xml:space="preserve">AC704, AC705, AC804, AC901, AC902, AC903, AC905, AC906, PR701, PR702, PR801, PR901, PR902, PY901</ns0:t>
             </ns0:r>
           </ns0:p>
         </ns0:tc>
@@ -28129,10 +28104,13 @@
                 <ns0:b/>
                 <ns0:bCs/>
               </ns0:rPr>
-              <ns0:t xml:space="preserve">PR303 NetAcad WLAN</ns0:t>
-            </ns0:r>
-            <ns0:r>
-              <ns0:t xml:space="preserve">, PR302</ns0:t>
+              <ns0:t xml:space="preserve">PR305</ns0:t>
+            </ns0:r>
+            <ns0:r>
+              <ns0:t xml:space="preserve"> </ns0:t>
+            </ns0:r>
+            <ns0:r>
+              <ns0:t xml:space="preserve">(red inalámbrica real), PR302, PR303 (certificación)</ns0:t>
             </ns0:r>
           </ns0:p>
         </ns0:tc>
@@ -28392,7 +28370,7 @@
               <ns0:pStyle ns0:val="Compact"/>
             </ns0:pPr>
             <ns0:r>
-              <ns0:t xml:space="preserve">Enrutamiento / VLAN · PR601, PR602,</ns0:t>
+              <ns0:t xml:space="preserve">Enrutamiento / VLAN ·</ns0:t>
             </ns0:r>
             <ns0:r>
               <ns0:t xml:space="preserve"> </ns0:t>
@@ -28408,17 +28386,7 @@
               <ns0:t xml:space="preserve"> </ns0:t>
             </ns0:r>
             <ns0:r>
-              <ns0:t xml:space="preserve">(VLAN taller),</ns0:t>
-            </ns0:r>
-            <ns0:r>
-              <ns0:t xml:space="preserve"> </ns0:t>
-            </ns0:r>
-            <ns0:r>
-              <ns0:rPr>
-                <ns0:b/>
-                <ns0:bCs/>
-              </ns0:rPr>
-              <ns0:t xml:space="preserve">PR603 NetAcad</ns0:t>
+              <ns0:t xml:space="preserve">(VLAN taller), PR601, PR602 y PR603 (certificación)</ns0:t>
             </ns0:r>
           </ns0:p>
         </ns0:tc>
@@ -28797,7 +28765,7 @@
           <ns0:i/>
           <ns0:iCs/>
         </ns0:rPr>
-        <ns0:t xml:space="preserve">Última actualización: 2026-10-28 (fecha de la formación en empresa, pesos enteros de las unidades, certificación y catálogo de refuerzo). Actualización anterior: 2026-09-16.</ns0:t>
+        <ns0:t xml:space="preserve">Última actualización: 2026-10-29 (revisión de jefatura de departamento: coherencia de instrumentos, anexo A completo y erratas). Actualización anterior: 2026-10-28.</ns0:t>
       </ns0:r>
     </ns0:p>
     <ns0:bookmarkEnd ns0:id="133"/>

</xml_diff>